<commit_message>
docs: suppression des fichiers pdf de la bibliographie
</commit_message>
<xml_diff>
--- a/memoire/Ge-Trouve.docx
+++ b/memoire/Ge-Trouve.docx
@@ -557,6 +557,302 @@
         <w:t xml:space="preserve"> génériques insuffisants</w:t>
       </w:r>
     </w:p>
+    <w:p/>
+    <w:p>
+      <w:pPr>
+        <w:rPr>
+          <w:i/>
+          <w:iCs/>
+          <w:color w:val="156082" w:themeColor="accent1"/>
+        </w:rPr>
+      </w:pPr>
+      <w:r>
+        <w:rPr>
+          <w:i/>
+          <w:iCs/>
+          <w:color w:val="156082" w:themeColor="accent1"/>
+        </w:rPr>
+        <w:t>Pour les chapitres suivants (2-7), il faudra ajouter d'autres sources, notamment :</w:t>
+      </w:r>
+    </w:p>
+    <w:p>
+      <w:pPr>
+        <w:numPr>
+          <w:ilvl w:val="0"/>
+          <w:numId w:val="13"/>
+        </w:numPr>
+        <w:rPr>
+          <w:i/>
+          <w:iCs/>
+          <w:color w:val="156082" w:themeColor="accent1"/>
+        </w:rPr>
+      </w:pPr>
+      <w:r>
+        <w:rPr>
+          <w:i/>
+          <w:iCs/>
+          <w:color w:val="156082" w:themeColor="accent1"/>
+        </w:rPr>
+        <w:t>Pour le Chapitre 2 (</w:t>
+      </w:r>
+      <w:proofErr w:type="spellStart"/>
+      <w:r>
+        <w:rPr>
+          <w:i/>
+          <w:iCs/>
+          <w:color w:val="156082" w:themeColor="accent1"/>
+        </w:rPr>
+        <w:t>frameworks</w:t>
+      </w:r>
+      <w:proofErr w:type="spellEnd"/>
+      <w:r>
+        <w:rPr>
+          <w:i/>
+          <w:iCs/>
+          <w:color w:val="156082" w:themeColor="accent1"/>
+        </w:rPr>
+        <w:t xml:space="preserve">) : documentation officielle </w:t>
+      </w:r>
+      <w:proofErr w:type="spellStart"/>
+      <w:r>
+        <w:rPr>
+          <w:i/>
+          <w:iCs/>
+          <w:color w:val="156082" w:themeColor="accent1"/>
+        </w:rPr>
+        <w:t>LangChain</w:t>
+      </w:r>
+      <w:proofErr w:type="spellEnd"/>
+      <w:r>
+        <w:rPr>
+          <w:i/>
+          <w:iCs/>
+          <w:color w:val="156082" w:themeColor="accent1"/>
+        </w:rPr>
+        <w:t>/</w:t>
+      </w:r>
+      <w:proofErr w:type="spellStart"/>
+      <w:r>
+        <w:rPr>
+          <w:i/>
+          <w:iCs/>
+          <w:color w:val="156082" w:themeColor="accent1"/>
+        </w:rPr>
+        <w:t>LlamaIndex</w:t>
+      </w:r>
+      <w:proofErr w:type="spellEnd"/>
+    </w:p>
+    <w:p>
+      <w:pPr>
+        <w:numPr>
+          <w:ilvl w:val="0"/>
+          <w:numId w:val="13"/>
+        </w:numPr>
+        <w:rPr>
+          <w:i/>
+          <w:iCs/>
+          <w:color w:val="156082" w:themeColor="accent1"/>
+        </w:rPr>
+      </w:pPr>
+      <w:r>
+        <w:rPr>
+          <w:i/>
+          <w:iCs/>
+          <w:color w:val="156082" w:themeColor="accent1"/>
+        </w:rPr>
+        <w:t>Pour le Chapitre 3 (</w:t>
+      </w:r>
+      <w:proofErr w:type="spellStart"/>
+      <w:r>
+        <w:rPr>
+          <w:i/>
+          <w:iCs/>
+          <w:color w:val="156082" w:themeColor="accent1"/>
+        </w:rPr>
+        <w:t>LLMs</w:t>
+      </w:r>
+      <w:proofErr w:type="spellEnd"/>
+      <w:r>
+        <w:rPr>
+          <w:i/>
+          <w:iCs/>
+          <w:color w:val="156082" w:themeColor="accent1"/>
+        </w:rPr>
+        <w:t xml:space="preserve">) : </w:t>
+      </w:r>
+      <w:proofErr w:type="spellStart"/>
+      <w:r>
+        <w:rPr>
+          <w:i/>
+          <w:iCs/>
+          <w:color w:val="156082" w:themeColor="accent1"/>
+        </w:rPr>
+        <w:t>papers</w:t>
+      </w:r>
+      <w:proofErr w:type="spellEnd"/>
+      <w:r>
+        <w:rPr>
+          <w:i/>
+          <w:iCs/>
+          <w:color w:val="156082" w:themeColor="accent1"/>
+        </w:rPr>
+        <w:t xml:space="preserve"> Mistral, Llama</w:t>
+      </w:r>
+    </w:p>
+    <w:p>
+      <w:pPr>
+        <w:numPr>
+          <w:ilvl w:val="0"/>
+          <w:numId w:val="13"/>
+        </w:numPr>
+        <w:rPr>
+          <w:i/>
+          <w:iCs/>
+          <w:color w:val="156082" w:themeColor="accent1"/>
+        </w:rPr>
+      </w:pPr>
+      <w:r>
+        <w:rPr>
+          <w:i/>
+          <w:iCs/>
+          <w:color w:val="156082" w:themeColor="accent1"/>
+        </w:rPr>
+        <w:t>Pour le Chapitre 4 (</w:t>
+      </w:r>
+      <w:proofErr w:type="spellStart"/>
+      <w:r>
+        <w:rPr>
+          <w:i/>
+          <w:iCs/>
+          <w:color w:val="156082" w:themeColor="accent1"/>
+        </w:rPr>
+        <w:t>embeddings</w:t>
+      </w:r>
+      <w:proofErr w:type="spellEnd"/>
+      <w:r>
+        <w:rPr>
+          <w:i/>
+          <w:iCs/>
+          <w:color w:val="156082" w:themeColor="accent1"/>
+        </w:rPr>
+        <w:t xml:space="preserve">) : </w:t>
+      </w:r>
+      <w:proofErr w:type="spellStart"/>
+      <w:r>
+        <w:rPr>
+          <w:i/>
+          <w:iCs/>
+          <w:color w:val="156082" w:themeColor="accent1"/>
+        </w:rPr>
+        <w:t>papers</w:t>
+      </w:r>
+      <w:proofErr w:type="spellEnd"/>
+      <w:r>
+        <w:rPr>
+          <w:i/>
+          <w:iCs/>
+          <w:color w:val="156082" w:themeColor="accent1"/>
+        </w:rPr>
+        <w:t xml:space="preserve"> sur les </w:t>
+      </w:r>
+      <w:proofErr w:type="spellStart"/>
+      <w:r>
+        <w:rPr>
+          <w:i/>
+          <w:iCs/>
+          <w:color w:val="156082" w:themeColor="accent1"/>
+        </w:rPr>
+        <w:t>embeddings</w:t>
+      </w:r>
+      <w:proofErr w:type="spellEnd"/>
+      <w:r>
+        <w:rPr>
+          <w:i/>
+          <w:iCs/>
+          <w:color w:val="156082" w:themeColor="accent1"/>
+        </w:rPr>
+        <w:t xml:space="preserve"> multilingues</w:t>
+      </w:r>
+    </w:p>
+    <w:p>
+      <w:pPr>
+        <w:numPr>
+          <w:ilvl w:val="0"/>
+          <w:numId w:val="13"/>
+        </w:numPr>
+        <w:rPr>
+          <w:i/>
+          <w:iCs/>
+          <w:color w:val="156082" w:themeColor="accent1"/>
+        </w:rPr>
+      </w:pPr>
+      <w:r>
+        <w:rPr>
+          <w:i/>
+          <w:iCs/>
+          <w:color w:val="156082" w:themeColor="accent1"/>
+        </w:rPr>
+        <w:t xml:space="preserve">Pour le Chapitre 5 (bases vectorielles) : benchmarks </w:t>
+      </w:r>
+      <w:proofErr w:type="spellStart"/>
+      <w:r>
+        <w:rPr>
+          <w:i/>
+          <w:iCs/>
+          <w:color w:val="156082" w:themeColor="accent1"/>
+        </w:rPr>
+        <w:t>Qdrant</w:t>
+      </w:r>
+      <w:proofErr w:type="spellEnd"/>
+      <w:r>
+        <w:rPr>
+          <w:i/>
+          <w:iCs/>
+          <w:color w:val="156082" w:themeColor="accent1"/>
+        </w:rPr>
+        <w:t>/Chroma/FAISS</w:t>
+      </w:r>
+    </w:p>
+    <w:p>
+      <w:pPr>
+        <w:numPr>
+          <w:ilvl w:val="0"/>
+          <w:numId w:val="13"/>
+        </w:numPr>
+        <w:rPr>
+          <w:i/>
+          <w:iCs/>
+          <w:color w:val="156082" w:themeColor="accent1"/>
+        </w:rPr>
+      </w:pPr>
+      <w:r>
+        <w:rPr>
+          <w:i/>
+          <w:iCs/>
+          <w:color w:val="156082" w:themeColor="accent1"/>
+        </w:rPr>
+        <w:t xml:space="preserve">Pour le Chapitre 7 (RAG francophone) : article </w:t>
+      </w:r>
+      <w:proofErr w:type="spellStart"/>
+      <w:r>
+        <w:rPr>
+          <w:i/>
+          <w:iCs/>
+          <w:color w:val="156082" w:themeColor="accent1"/>
+        </w:rPr>
+        <w:t>ICTjournal</w:t>
+      </w:r>
+      <w:proofErr w:type="spellEnd"/>
+      <w:r>
+        <w:rPr>
+          <w:i/>
+          <w:iCs/>
+          <w:color w:val="156082" w:themeColor="accent1"/>
+        </w:rPr>
+        <w:t xml:space="preserve"> que tu as déjà</w:t>
+      </w:r>
+    </w:p>
+    <w:p/>
     <w:p>
       <w:pPr>
         <w:rPr>
@@ -880,6 +1176,7 @@
     </w:p>
     <w:p>
       <w:r>
+        <w:lastRenderedPageBreak/>
         <w:t xml:space="preserve">Les </w:t>
       </w:r>
       <w:proofErr w:type="spellStart"/>
@@ -902,15 +1199,7 @@
       </w:r>
       <w:proofErr w:type="spellEnd"/>
       <w:r>
-        <w:t xml:space="preserve"> embed-v4 pour le français), la dimension (768-1536 pour un bon équilibre), le domaine (spécifique comme Qwen3 pour le code) et le coût (open-source comme NV-Embed-v2 gratuit vs payants comme </w:t>
-      </w:r>
-      <w:proofErr w:type="spellStart"/>
-      <w:r>
-        <w:t>OpenAI</w:t>
-      </w:r>
-      <w:proofErr w:type="spellEnd"/>
-      <w:r>
-        <w:t>).</w:t>
+        <w:t xml:space="preserve"> embed-v4 pour le français), la dimension (768-1536 pour un bon équilibre), le domaine (spécifique comme Qwen3 pour le code) et le coût (open-source comme NV-Embed-v2 gratuit vs payants comme OpenAI).</w:t>
       </w:r>
       <w:r>
         <w:t xml:space="preserve"> </w:t>
@@ -974,7 +1263,6 @@
     </w:p>
     <w:p>
       <w:r>
-        <w:lastRenderedPageBreak/>
         <w:t xml:space="preserve">La base vectorielle stocke les </w:t>
       </w:r>
       <w:proofErr w:type="spellStart"/>
@@ -1355,7 +1643,11 @@
       </w:r>
       <w:proofErr w:type="spellEnd"/>
       <w:r>
-        <w:t>) recommandent le RAG pour connecter données d'entreprise à l'IA, avec focus sur RGPD et souveraineté (</w:t>
+        <w:t xml:space="preserve">) recommandent le RAG pour connecter données d'entreprise à l'IA, avec </w:t>
+      </w:r>
+      <w:r>
+        <w:lastRenderedPageBreak/>
+        <w:t>focus sur RGPD et souveraineté (</w:t>
       </w:r>
       <w:proofErr w:type="spellStart"/>
       <w:r>
@@ -1981,6 +2273,155 @@
     </w:lvl>
   </w:abstractNum>
   <w:abstractNum w:abstractNumId="4" w15:restartNumberingAfterBreak="0">
+    <w:nsid w:val="2A4C72C2"/>
+    <w:multiLevelType w:val="multilevel"/>
+    <w:tmpl w:val="A5EA9BC4"/>
+    <w:lvl w:ilvl="0">
+      <w:start w:val="1"/>
+      <w:numFmt w:val="bullet"/>
+      <w:lvlText w:val=""/>
+      <w:lvlJc w:val="left"/>
+      <w:pPr>
+        <w:tabs>
+          <w:tab w:val="num" w:pos="720"/>
+        </w:tabs>
+        <w:ind w:left="720" w:hanging="360"/>
+      </w:pPr>
+      <w:rPr>
+        <w:rFonts w:ascii="Symbol" w:hAnsi="Symbol" w:hint="default"/>
+        <w:sz w:val="20"/>
+      </w:rPr>
+    </w:lvl>
+    <w:lvl w:ilvl="1" w:tentative="1">
+      <w:start w:val="1"/>
+      <w:numFmt w:val="bullet"/>
+      <w:lvlText w:val="o"/>
+      <w:lvlJc w:val="left"/>
+      <w:pPr>
+        <w:tabs>
+          <w:tab w:val="num" w:pos="1440"/>
+        </w:tabs>
+        <w:ind w:left="1440" w:hanging="360"/>
+      </w:pPr>
+      <w:rPr>
+        <w:rFonts w:ascii="Courier New" w:hAnsi="Courier New" w:hint="default"/>
+        <w:sz w:val="20"/>
+      </w:rPr>
+    </w:lvl>
+    <w:lvl w:ilvl="2" w:tentative="1">
+      <w:start w:val="1"/>
+      <w:numFmt w:val="bullet"/>
+      <w:lvlText w:val=""/>
+      <w:lvlJc w:val="left"/>
+      <w:pPr>
+        <w:tabs>
+          <w:tab w:val="num" w:pos="2160"/>
+        </w:tabs>
+        <w:ind w:left="2160" w:hanging="360"/>
+      </w:pPr>
+      <w:rPr>
+        <w:rFonts w:ascii="Wingdings" w:hAnsi="Wingdings" w:hint="default"/>
+        <w:sz w:val="20"/>
+      </w:rPr>
+    </w:lvl>
+    <w:lvl w:ilvl="3" w:tentative="1">
+      <w:start w:val="1"/>
+      <w:numFmt w:val="bullet"/>
+      <w:lvlText w:val=""/>
+      <w:lvlJc w:val="left"/>
+      <w:pPr>
+        <w:tabs>
+          <w:tab w:val="num" w:pos="2880"/>
+        </w:tabs>
+        <w:ind w:left="2880" w:hanging="360"/>
+      </w:pPr>
+      <w:rPr>
+        <w:rFonts w:ascii="Wingdings" w:hAnsi="Wingdings" w:hint="default"/>
+        <w:sz w:val="20"/>
+      </w:rPr>
+    </w:lvl>
+    <w:lvl w:ilvl="4" w:tentative="1">
+      <w:start w:val="1"/>
+      <w:numFmt w:val="bullet"/>
+      <w:lvlText w:val=""/>
+      <w:lvlJc w:val="left"/>
+      <w:pPr>
+        <w:tabs>
+          <w:tab w:val="num" w:pos="3600"/>
+        </w:tabs>
+        <w:ind w:left="3600" w:hanging="360"/>
+      </w:pPr>
+      <w:rPr>
+        <w:rFonts w:ascii="Wingdings" w:hAnsi="Wingdings" w:hint="default"/>
+        <w:sz w:val="20"/>
+      </w:rPr>
+    </w:lvl>
+    <w:lvl w:ilvl="5" w:tentative="1">
+      <w:start w:val="1"/>
+      <w:numFmt w:val="bullet"/>
+      <w:lvlText w:val=""/>
+      <w:lvlJc w:val="left"/>
+      <w:pPr>
+        <w:tabs>
+          <w:tab w:val="num" w:pos="4320"/>
+        </w:tabs>
+        <w:ind w:left="4320" w:hanging="360"/>
+      </w:pPr>
+      <w:rPr>
+        <w:rFonts w:ascii="Wingdings" w:hAnsi="Wingdings" w:hint="default"/>
+        <w:sz w:val="20"/>
+      </w:rPr>
+    </w:lvl>
+    <w:lvl w:ilvl="6" w:tentative="1">
+      <w:start w:val="1"/>
+      <w:numFmt w:val="bullet"/>
+      <w:lvlText w:val=""/>
+      <w:lvlJc w:val="left"/>
+      <w:pPr>
+        <w:tabs>
+          <w:tab w:val="num" w:pos="5040"/>
+        </w:tabs>
+        <w:ind w:left="5040" w:hanging="360"/>
+      </w:pPr>
+      <w:rPr>
+        <w:rFonts w:ascii="Wingdings" w:hAnsi="Wingdings" w:hint="default"/>
+        <w:sz w:val="20"/>
+      </w:rPr>
+    </w:lvl>
+    <w:lvl w:ilvl="7" w:tentative="1">
+      <w:start w:val="1"/>
+      <w:numFmt w:val="bullet"/>
+      <w:lvlText w:val=""/>
+      <w:lvlJc w:val="left"/>
+      <w:pPr>
+        <w:tabs>
+          <w:tab w:val="num" w:pos="5760"/>
+        </w:tabs>
+        <w:ind w:left="5760" w:hanging="360"/>
+      </w:pPr>
+      <w:rPr>
+        <w:rFonts w:ascii="Wingdings" w:hAnsi="Wingdings" w:hint="default"/>
+        <w:sz w:val="20"/>
+      </w:rPr>
+    </w:lvl>
+    <w:lvl w:ilvl="8" w:tentative="1">
+      <w:start w:val="1"/>
+      <w:numFmt w:val="bullet"/>
+      <w:lvlText w:val=""/>
+      <w:lvlJc w:val="left"/>
+      <w:pPr>
+        <w:tabs>
+          <w:tab w:val="num" w:pos="6480"/>
+        </w:tabs>
+        <w:ind w:left="6480" w:hanging="360"/>
+      </w:pPr>
+      <w:rPr>
+        <w:rFonts w:ascii="Wingdings" w:hAnsi="Wingdings" w:hint="default"/>
+        <w:sz w:val="20"/>
+      </w:rPr>
+    </w:lvl>
+  </w:abstractNum>
+  <w:abstractNum w:abstractNumId="5" w15:restartNumberingAfterBreak="0">
     <w:nsid w:val="3962342B"/>
     <w:multiLevelType w:val="multilevel"/>
     <w:tmpl w:val="1D6C398A"/>
@@ -2129,7 +2570,7 @@
       </w:rPr>
     </w:lvl>
   </w:abstractNum>
-  <w:abstractNum w:abstractNumId="5" w15:restartNumberingAfterBreak="0">
+  <w:abstractNum w:abstractNumId="6" w15:restartNumberingAfterBreak="0">
     <w:nsid w:val="3D7D281A"/>
     <w:multiLevelType w:val="multilevel"/>
     <w:tmpl w:val="73AC2E0A"/>
@@ -2278,7 +2719,7 @@
       </w:rPr>
     </w:lvl>
   </w:abstractNum>
-  <w:abstractNum w:abstractNumId="6" w15:restartNumberingAfterBreak="0">
+  <w:abstractNum w:abstractNumId="7" w15:restartNumberingAfterBreak="0">
     <w:nsid w:val="66F33668"/>
     <w:multiLevelType w:val="multilevel"/>
     <w:tmpl w:val="C2968820"/>
@@ -2427,7 +2868,7 @@
       </w:rPr>
     </w:lvl>
   </w:abstractNum>
-  <w:abstractNum w:abstractNumId="7" w15:restartNumberingAfterBreak="0">
+  <w:abstractNum w:abstractNumId="8" w15:restartNumberingAfterBreak="0">
     <w:nsid w:val="695946DD"/>
     <w:multiLevelType w:val="multilevel"/>
     <w:tmpl w:val="BAE0CAB0"/>
@@ -2576,7 +3017,7 @@
       </w:rPr>
     </w:lvl>
   </w:abstractNum>
-  <w:abstractNum w:abstractNumId="8" w15:restartNumberingAfterBreak="0">
+  <w:abstractNum w:abstractNumId="9" w15:restartNumberingAfterBreak="0">
     <w:nsid w:val="698D1189"/>
     <w:multiLevelType w:val="multilevel"/>
     <w:tmpl w:val="F1F25A92"/>
@@ -2725,7 +3166,7 @@
       </w:rPr>
     </w:lvl>
   </w:abstractNum>
-  <w:abstractNum w:abstractNumId="9" w15:restartNumberingAfterBreak="0">
+  <w:abstractNum w:abstractNumId="10" w15:restartNumberingAfterBreak="0">
     <w:nsid w:val="6D0D58DC"/>
     <w:multiLevelType w:val="multilevel"/>
     <w:tmpl w:val="966407A8"/>
@@ -2874,7 +3315,7 @@
       </w:rPr>
     </w:lvl>
   </w:abstractNum>
-  <w:abstractNum w:abstractNumId="10" w15:restartNumberingAfterBreak="0">
+  <w:abstractNum w:abstractNumId="11" w15:restartNumberingAfterBreak="0">
     <w:nsid w:val="78F0749E"/>
     <w:multiLevelType w:val="multilevel"/>
     <w:tmpl w:val="5922D760"/>
@@ -3023,7 +3464,7 @@
       </w:rPr>
     </w:lvl>
   </w:abstractNum>
-  <w:abstractNum w:abstractNumId="11" w15:restartNumberingAfterBreak="0">
+  <w:abstractNum w:abstractNumId="12" w15:restartNumberingAfterBreak="0">
     <w:nsid w:val="7E500D2B"/>
     <w:multiLevelType w:val="multilevel"/>
     <w:tmpl w:val="BABC7762"/>
@@ -3173,7 +3614,7 @@
     </w:lvl>
   </w:abstractNum>
   <w:num w:numId="1" w16cid:durableId="775444032">
-    <w:abstractNumId w:val="11"/>
+    <w:abstractNumId w:val="12"/>
   </w:num>
   <w:num w:numId="2" w16cid:durableId="1919241981">
     <w:abstractNumId w:val="2"/>
@@ -3182,30 +3623,33 @@
     <w:abstractNumId w:val="0"/>
   </w:num>
   <w:num w:numId="4" w16cid:durableId="181818229">
+    <w:abstractNumId w:val="9"/>
+  </w:num>
+  <w:num w:numId="5" w16cid:durableId="1079323579">
     <w:abstractNumId w:val="8"/>
   </w:num>
-  <w:num w:numId="5" w16cid:durableId="1079323579">
+  <w:num w:numId="6" w16cid:durableId="1823154635">
     <w:abstractNumId w:val="7"/>
-  </w:num>
-  <w:num w:numId="6" w16cid:durableId="1823154635">
-    <w:abstractNumId w:val="6"/>
   </w:num>
   <w:num w:numId="7" w16cid:durableId="2319072">
     <w:abstractNumId w:val="3"/>
   </w:num>
   <w:num w:numId="8" w16cid:durableId="300506653">
-    <w:abstractNumId w:val="10"/>
+    <w:abstractNumId w:val="11"/>
   </w:num>
   <w:num w:numId="9" w16cid:durableId="1577013300">
-    <w:abstractNumId w:val="5"/>
+    <w:abstractNumId w:val="6"/>
   </w:num>
   <w:num w:numId="10" w16cid:durableId="1821264856">
     <w:abstractNumId w:val="1"/>
   </w:num>
   <w:num w:numId="11" w16cid:durableId="211577877">
-    <w:abstractNumId w:val="9"/>
+    <w:abstractNumId w:val="10"/>
   </w:num>
   <w:num w:numId="12" w16cid:durableId="1698651273">
+    <w:abstractNumId w:val="5"/>
+  </w:num>
+  <w:num w:numId="13" w16cid:durableId="381104760">
     <w:abstractNumId w:val="4"/>
   </w:num>
 </w:numbering>
@@ -3613,11 +4057,11 @@
     <w:qFormat/>
     <w:rsid w:val="00EC4705"/>
   </w:style>
-  <w:style w:type="paragraph" w:styleId="Heading1">
+  <w:style w:type="paragraph" w:styleId="Titre1">
     <w:name w:val="heading 1"/>
     <w:basedOn w:val="Normal"/>
     <w:next w:val="Normal"/>
-    <w:link w:val="Heading1Char"/>
+    <w:link w:val="Titre1Car"/>
     <w:uiPriority w:val="9"/>
     <w:qFormat/>
     <w:rsid w:val="00082F1E"/>
@@ -3634,11 +4078,11 @@
       <w:szCs w:val="40"/>
     </w:rPr>
   </w:style>
-  <w:style w:type="paragraph" w:styleId="Heading2">
+  <w:style w:type="paragraph" w:styleId="Titre2">
     <w:name w:val="heading 2"/>
     <w:basedOn w:val="Normal"/>
     <w:next w:val="Normal"/>
-    <w:link w:val="Heading2Char"/>
+    <w:link w:val="Titre2Car"/>
     <w:uiPriority w:val="9"/>
     <w:semiHidden/>
     <w:unhideWhenUsed/>
@@ -3657,11 +4101,11 @@
       <w:szCs w:val="32"/>
     </w:rPr>
   </w:style>
-  <w:style w:type="paragraph" w:styleId="Heading3">
+  <w:style w:type="paragraph" w:styleId="Titre3">
     <w:name w:val="heading 3"/>
     <w:basedOn w:val="Normal"/>
     <w:next w:val="Normal"/>
-    <w:link w:val="Heading3Char"/>
+    <w:link w:val="Titre3Car"/>
     <w:uiPriority w:val="9"/>
     <w:semiHidden/>
     <w:unhideWhenUsed/>
@@ -3680,11 +4124,11 @@
       <w:szCs w:val="28"/>
     </w:rPr>
   </w:style>
-  <w:style w:type="paragraph" w:styleId="Heading4">
+  <w:style w:type="paragraph" w:styleId="Titre4">
     <w:name w:val="heading 4"/>
     <w:basedOn w:val="Normal"/>
     <w:next w:val="Normal"/>
-    <w:link w:val="Heading4Char"/>
+    <w:link w:val="Titre4Car"/>
     <w:uiPriority w:val="9"/>
     <w:semiHidden/>
     <w:unhideWhenUsed/>
@@ -3703,11 +4147,11 @@
       <w:color w:val="0F4761" w:themeColor="accent1" w:themeShade="BF"/>
     </w:rPr>
   </w:style>
-  <w:style w:type="paragraph" w:styleId="Heading5">
+  <w:style w:type="paragraph" w:styleId="Titre5">
     <w:name w:val="heading 5"/>
     <w:basedOn w:val="Normal"/>
     <w:next w:val="Normal"/>
-    <w:link w:val="Heading5Char"/>
+    <w:link w:val="Titre5Car"/>
     <w:uiPriority w:val="9"/>
     <w:semiHidden/>
     <w:unhideWhenUsed/>
@@ -3724,11 +4168,11 @@
       <w:color w:val="0F4761" w:themeColor="accent1" w:themeShade="BF"/>
     </w:rPr>
   </w:style>
-  <w:style w:type="paragraph" w:styleId="Heading6">
+  <w:style w:type="paragraph" w:styleId="Titre6">
     <w:name w:val="heading 6"/>
     <w:basedOn w:val="Normal"/>
     <w:next w:val="Normal"/>
-    <w:link w:val="Heading6Char"/>
+    <w:link w:val="Titre6Car"/>
     <w:uiPriority w:val="9"/>
     <w:semiHidden/>
     <w:unhideWhenUsed/>
@@ -3747,11 +4191,11 @@
       <w:color w:val="595959" w:themeColor="text1" w:themeTint="A6"/>
     </w:rPr>
   </w:style>
-  <w:style w:type="paragraph" w:styleId="Heading7">
+  <w:style w:type="paragraph" w:styleId="Titre7">
     <w:name w:val="heading 7"/>
     <w:basedOn w:val="Normal"/>
     <w:next w:val="Normal"/>
-    <w:link w:val="Heading7Char"/>
+    <w:link w:val="Titre7Car"/>
     <w:uiPriority w:val="9"/>
     <w:semiHidden/>
     <w:unhideWhenUsed/>
@@ -3768,11 +4212,11 @@
       <w:color w:val="595959" w:themeColor="text1" w:themeTint="A6"/>
     </w:rPr>
   </w:style>
-  <w:style w:type="paragraph" w:styleId="Heading8">
+  <w:style w:type="paragraph" w:styleId="Titre8">
     <w:name w:val="heading 8"/>
     <w:basedOn w:val="Normal"/>
     <w:next w:val="Normal"/>
-    <w:link w:val="Heading8Char"/>
+    <w:link w:val="Titre8Car"/>
     <w:uiPriority w:val="9"/>
     <w:semiHidden/>
     <w:unhideWhenUsed/>
@@ -3791,11 +4235,11 @@
       <w:color w:val="272727" w:themeColor="text1" w:themeTint="D8"/>
     </w:rPr>
   </w:style>
-  <w:style w:type="paragraph" w:styleId="Heading9">
+  <w:style w:type="paragraph" w:styleId="Titre9">
     <w:name w:val="heading 9"/>
     <w:basedOn w:val="Normal"/>
     <w:next w:val="Normal"/>
-    <w:link w:val="Heading9Char"/>
+    <w:link w:val="Titre9Car"/>
     <w:uiPriority w:val="9"/>
     <w:semiHidden/>
     <w:unhideWhenUsed/>
@@ -3812,12 +4256,12 @@
       <w:color w:val="272727" w:themeColor="text1" w:themeTint="D8"/>
     </w:rPr>
   </w:style>
-  <w:style w:type="character" w:default="1" w:styleId="DefaultParagraphFont">
+  <w:style w:type="character" w:default="1" w:styleId="Policepardfaut">
     <w:name w:val="Default Paragraph Font"/>
     <w:uiPriority w:val="1"/>
     <w:unhideWhenUsed/>
   </w:style>
-  <w:style w:type="table" w:default="1" w:styleId="TableNormal">
+  <w:style w:type="table" w:default="1" w:styleId="TableauNormal">
     <w:name w:val="Normal Table"/>
     <w:uiPriority w:val="99"/>
     <w:semiHidden/>
@@ -3832,16 +4276,16 @@
       </w:tblCellMar>
     </w:tblPr>
   </w:style>
-  <w:style w:type="numbering" w:default="1" w:styleId="NoList">
+  <w:style w:type="numbering" w:default="1" w:styleId="Aucuneliste">
     <w:name w:val="No List"/>
     <w:uiPriority w:val="99"/>
     <w:semiHidden/>
     <w:unhideWhenUsed/>
   </w:style>
-  <w:style w:type="character" w:customStyle="1" w:styleId="Heading1Char">
-    <w:name w:val="Heading 1 Char"/>
-    <w:basedOn w:val="DefaultParagraphFont"/>
-    <w:link w:val="Heading1"/>
+  <w:style w:type="character" w:customStyle="1" w:styleId="Titre1Car">
+    <w:name w:val="Titre 1 Car"/>
+    <w:basedOn w:val="Policepardfaut"/>
+    <w:link w:val="Titre1"/>
     <w:uiPriority w:val="9"/>
     <w:rsid w:val="00082F1E"/>
     <w:rPr>
@@ -3851,10 +4295,10 @@
       <w:szCs w:val="40"/>
     </w:rPr>
   </w:style>
-  <w:style w:type="character" w:customStyle="1" w:styleId="Heading2Char">
-    <w:name w:val="Heading 2 Char"/>
-    <w:basedOn w:val="DefaultParagraphFont"/>
-    <w:link w:val="Heading2"/>
+  <w:style w:type="character" w:customStyle="1" w:styleId="Titre2Car">
+    <w:name w:val="Titre 2 Car"/>
+    <w:basedOn w:val="Policepardfaut"/>
+    <w:link w:val="Titre2"/>
     <w:uiPriority w:val="9"/>
     <w:semiHidden/>
     <w:rsid w:val="00082F1E"/>
@@ -3865,10 +4309,10 @@
       <w:szCs w:val="32"/>
     </w:rPr>
   </w:style>
-  <w:style w:type="character" w:customStyle="1" w:styleId="Heading3Char">
-    <w:name w:val="Heading 3 Char"/>
-    <w:basedOn w:val="DefaultParagraphFont"/>
-    <w:link w:val="Heading3"/>
+  <w:style w:type="character" w:customStyle="1" w:styleId="Titre3Car">
+    <w:name w:val="Titre 3 Car"/>
+    <w:basedOn w:val="Policepardfaut"/>
+    <w:link w:val="Titre3"/>
     <w:uiPriority w:val="9"/>
     <w:semiHidden/>
     <w:rsid w:val="00082F1E"/>
@@ -3879,10 +4323,10 @@
       <w:szCs w:val="28"/>
     </w:rPr>
   </w:style>
-  <w:style w:type="character" w:customStyle="1" w:styleId="Heading4Char">
-    <w:name w:val="Heading 4 Char"/>
-    <w:basedOn w:val="DefaultParagraphFont"/>
-    <w:link w:val="Heading4"/>
+  <w:style w:type="character" w:customStyle="1" w:styleId="Titre4Car">
+    <w:name w:val="Titre 4 Car"/>
+    <w:basedOn w:val="Policepardfaut"/>
+    <w:link w:val="Titre4"/>
     <w:uiPriority w:val="9"/>
     <w:semiHidden/>
     <w:rsid w:val="00082F1E"/>
@@ -3893,10 +4337,10 @@
       <w:color w:val="0F4761" w:themeColor="accent1" w:themeShade="BF"/>
     </w:rPr>
   </w:style>
-  <w:style w:type="character" w:customStyle="1" w:styleId="Heading5Char">
-    <w:name w:val="Heading 5 Char"/>
-    <w:basedOn w:val="DefaultParagraphFont"/>
-    <w:link w:val="Heading5"/>
+  <w:style w:type="character" w:customStyle="1" w:styleId="Titre5Car">
+    <w:name w:val="Titre 5 Car"/>
+    <w:basedOn w:val="Policepardfaut"/>
+    <w:link w:val="Titre5"/>
     <w:uiPriority w:val="9"/>
     <w:semiHidden/>
     <w:rsid w:val="00082F1E"/>
@@ -3905,10 +4349,10 @@
       <w:color w:val="0F4761" w:themeColor="accent1" w:themeShade="BF"/>
     </w:rPr>
   </w:style>
-  <w:style w:type="character" w:customStyle="1" w:styleId="Heading6Char">
-    <w:name w:val="Heading 6 Char"/>
-    <w:basedOn w:val="DefaultParagraphFont"/>
-    <w:link w:val="Heading6"/>
+  <w:style w:type="character" w:customStyle="1" w:styleId="Titre6Car">
+    <w:name w:val="Titre 6 Car"/>
+    <w:basedOn w:val="Policepardfaut"/>
+    <w:link w:val="Titre6"/>
     <w:uiPriority w:val="9"/>
     <w:semiHidden/>
     <w:rsid w:val="00082F1E"/>
@@ -3919,10 +4363,10 @@
       <w:color w:val="595959" w:themeColor="text1" w:themeTint="A6"/>
     </w:rPr>
   </w:style>
-  <w:style w:type="character" w:customStyle="1" w:styleId="Heading7Char">
-    <w:name w:val="Heading 7 Char"/>
-    <w:basedOn w:val="DefaultParagraphFont"/>
-    <w:link w:val="Heading7"/>
+  <w:style w:type="character" w:customStyle="1" w:styleId="Titre7Car">
+    <w:name w:val="Titre 7 Car"/>
+    <w:basedOn w:val="Policepardfaut"/>
+    <w:link w:val="Titre7"/>
     <w:uiPriority w:val="9"/>
     <w:semiHidden/>
     <w:rsid w:val="00082F1E"/>
@@ -3931,10 +4375,10 @@
       <w:color w:val="595959" w:themeColor="text1" w:themeTint="A6"/>
     </w:rPr>
   </w:style>
-  <w:style w:type="character" w:customStyle="1" w:styleId="Heading8Char">
-    <w:name w:val="Heading 8 Char"/>
-    <w:basedOn w:val="DefaultParagraphFont"/>
-    <w:link w:val="Heading8"/>
+  <w:style w:type="character" w:customStyle="1" w:styleId="Titre8Car">
+    <w:name w:val="Titre 8 Car"/>
+    <w:basedOn w:val="Policepardfaut"/>
+    <w:link w:val="Titre8"/>
     <w:uiPriority w:val="9"/>
     <w:semiHidden/>
     <w:rsid w:val="00082F1E"/>
@@ -3945,10 +4389,10 @@
       <w:color w:val="272727" w:themeColor="text1" w:themeTint="D8"/>
     </w:rPr>
   </w:style>
-  <w:style w:type="character" w:customStyle="1" w:styleId="Heading9Char">
-    <w:name w:val="Heading 9 Char"/>
-    <w:basedOn w:val="DefaultParagraphFont"/>
-    <w:link w:val="Heading9"/>
+  <w:style w:type="character" w:customStyle="1" w:styleId="Titre9Car">
+    <w:name w:val="Titre 9 Car"/>
+    <w:basedOn w:val="Policepardfaut"/>
+    <w:link w:val="Titre9"/>
     <w:uiPriority w:val="9"/>
     <w:semiHidden/>
     <w:rsid w:val="00082F1E"/>
@@ -3957,11 +4401,11 @@
       <w:color w:val="272727" w:themeColor="text1" w:themeTint="D8"/>
     </w:rPr>
   </w:style>
-  <w:style w:type="paragraph" w:styleId="Title">
+  <w:style w:type="paragraph" w:styleId="Titre">
     <w:name w:val="Title"/>
     <w:basedOn w:val="Normal"/>
     <w:next w:val="Normal"/>
-    <w:link w:val="TitleChar"/>
+    <w:link w:val="TitreCar"/>
     <w:uiPriority w:val="10"/>
     <w:qFormat/>
     <w:rsid w:val="00082F1E"/>
@@ -3977,10 +4421,10 @@
       <w:szCs w:val="56"/>
     </w:rPr>
   </w:style>
-  <w:style w:type="character" w:customStyle="1" w:styleId="TitleChar">
-    <w:name w:val="Title Char"/>
-    <w:basedOn w:val="DefaultParagraphFont"/>
-    <w:link w:val="Title"/>
+  <w:style w:type="character" w:customStyle="1" w:styleId="TitreCar">
+    <w:name w:val="Titre Car"/>
+    <w:basedOn w:val="Policepardfaut"/>
+    <w:link w:val="Titre"/>
     <w:uiPriority w:val="10"/>
     <w:rsid w:val="00082F1E"/>
     <w:rPr>
@@ -3991,11 +4435,11 @@
       <w:szCs w:val="56"/>
     </w:rPr>
   </w:style>
-  <w:style w:type="paragraph" w:styleId="Subtitle">
+  <w:style w:type="paragraph" w:styleId="Sous-titre">
     <w:name w:val="Subtitle"/>
     <w:basedOn w:val="Normal"/>
     <w:next w:val="Normal"/>
-    <w:link w:val="SubtitleChar"/>
+    <w:link w:val="Sous-titreCar"/>
     <w:uiPriority w:val="11"/>
     <w:qFormat/>
     <w:rsid w:val="00082F1E"/>
@@ -4012,10 +4456,10 @@
       <w:szCs w:val="28"/>
     </w:rPr>
   </w:style>
-  <w:style w:type="character" w:customStyle="1" w:styleId="SubtitleChar">
-    <w:name w:val="Subtitle Char"/>
-    <w:basedOn w:val="DefaultParagraphFont"/>
-    <w:link w:val="Subtitle"/>
+  <w:style w:type="character" w:customStyle="1" w:styleId="Sous-titreCar">
+    <w:name w:val="Sous-titre Car"/>
+    <w:basedOn w:val="Policepardfaut"/>
+    <w:link w:val="Sous-titre"/>
     <w:uiPriority w:val="11"/>
     <w:rsid w:val="00082F1E"/>
     <w:rPr>
@@ -4026,11 +4470,11 @@
       <w:szCs w:val="28"/>
     </w:rPr>
   </w:style>
-  <w:style w:type="paragraph" w:styleId="Quote">
+  <w:style w:type="paragraph" w:styleId="Citation">
     <w:name w:val="Quote"/>
     <w:basedOn w:val="Normal"/>
     <w:next w:val="Normal"/>
-    <w:link w:val="QuoteChar"/>
+    <w:link w:val="CitationCar"/>
     <w:uiPriority w:val="29"/>
     <w:qFormat/>
     <w:rsid w:val="00082F1E"/>
@@ -4044,10 +4488,10 @@
       <w:color w:val="404040" w:themeColor="text1" w:themeTint="BF"/>
     </w:rPr>
   </w:style>
-  <w:style w:type="character" w:customStyle="1" w:styleId="QuoteChar">
-    <w:name w:val="Quote Char"/>
-    <w:basedOn w:val="DefaultParagraphFont"/>
-    <w:link w:val="Quote"/>
+  <w:style w:type="character" w:customStyle="1" w:styleId="CitationCar">
+    <w:name w:val="Citation Car"/>
+    <w:basedOn w:val="Policepardfaut"/>
+    <w:link w:val="Citation"/>
     <w:uiPriority w:val="29"/>
     <w:rsid w:val="00082F1E"/>
     <w:rPr>
@@ -4056,7 +4500,7 @@
       <w:color w:val="404040" w:themeColor="text1" w:themeTint="BF"/>
     </w:rPr>
   </w:style>
-  <w:style w:type="paragraph" w:styleId="ListParagraph">
+  <w:style w:type="paragraph" w:styleId="Paragraphedeliste">
     <w:name w:val="List Paragraph"/>
     <w:basedOn w:val="Normal"/>
     <w:uiPriority w:val="34"/>
@@ -4067,9 +4511,9 @@
       <w:contextualSpacing/>
     </w:pPr>
   </w:style>
-  <w:style w:type="character" w:styleId="IntenseEmphasis">
+  <w:style w:type="character" w:styleId="Accentuationintense">
     <w:name w:val="Intense Emphasis"/>
-    <w:basedOn w:val="DefaultParagraphFont"/>
+    <w:basedOn w:val="Policepardfaut"/>
     <w:uiPriority w:val="21"/>
     <w:qFormat/>
     <w:rsid w:val="00082F1E"/>
@@ -4079,11 +4523,11 @@
       <w:color w:val="0F4761" w:themeColor="accent1" w:themeShade="BF"/>
     </w:rPr>
   </w:style>
-  <w:style w:type="paragraph" w:styleId="IntenseQuote">
+  <w:style w:type="paragraph" w:styleId="Citationintense">
     <w:name w:val="Intense Quote"/>
     <w:basedOn w:val="Normal"/>
     <w:next w:val="Normal"/>
-    <w:link w:val="IntenseQuoteChar"/>
+    <w:link w:val="CitationintenseCar"/>
     <w:uiPriority w:val="30"/>
     <w:qFormat/>
     <w:rsid w:val="00082F1E"/>
@@ -4102,10 +4546,10 @@
       <w:color w:val="0F4761" w:themeColor="accent1" w:themeShade="BF"/>
     </w:rPr>
   </w:style>
-  <w:style w:type="character" w:customStyle="1" w:styleId="IntenseQuoteChar">
-    <w:name w:val="Intense Quote Char"/>
-    <w:basedOn w:val="DefaultParagraphFont"/>
-    <w:link w:val="IntenseQuote"/>
+  <w:style w:type="character" w:customStyle="1" w:styleId="CitationintenseCar">
+    <w:name w:val="Citation intense Car"/>
+    <w:basedOn w:val="Policepardfaut"/>
+    <w:link w:val="Citationintense"/>
     <w:uiPriority w:val="30"/>
     <w:rsid w:val="00082F1E"/>
     <w:rPr>
@@ -4114,9 +4558,9 @@
       <w:color w:val="0F4761" w:themeColor="accent1" w:themeShade="BF"/>
     </w:rPr>
   </w:style>
-  <w:style w:type="character" w:styleId="IntenseReference">
+  <w:style w:type="character" w:styleId="Rfrenceintense">
     <w:name w:val="Intense Reference"/>
-    <w:basedOn w:val="DefaultParagraphFont"/>
+    <w:basedOn w:val="Policepardfaut"/>
     <w:uiPriority w:val="32"/>
     <w:qFormat/>
     <w:rsid w:val="00082F1E"/>

</xml_diff>

<commit_message>
Suppression de la bibliographie du repo
</commit_message>
<xml_diff>
--- a/memoire/Ge-Trouve.docx
+++ b/memoire/Ge-Trouve.docx
@@ -557,6 +557,302 @@
         <w:t xml:space="preserve"> génériques insuffisants</w:t>
       </w:r>
     </w:p>
+    <w:p/>
+    <w:p>
+      <w:pPr>
+        <w:rPr>
+          <w:i/>
+          <w:iCs/>
+          <w:color w:val="156082" w:themeColor="accent1"/>
+        </w:rPr>
+      </w:pPr>
+      <w:r>
+        <w:rPr>
+          <w:i/>
+          <w:iCs/>
+          <w:color w:val="156082" w:themeColor="accent1"/>
+        </w:rPr>
+        <w:t>Pour les chapitres suivants (2-7), il faudra ajouter d'autres sources, notamment :</w:t>
+      </w:r>
+    </w:p>
+    <w:p>
+      <w:pPr>
+        <w:numPr>
+          <w:ilvl w:val="0"/>
+          <w:numId w:val="13"/>
+        </w:numPr>
+        <w:rPr>
+          <w:i/>
+          <w:iCs/>
+          <w:color w:val="156082" w:themeColor="accent1"/>
+        </w:rPr>
+      </w:pPr>
+      <w:r>
+        <w:rPr>
+          <w:i/>
+          <w:iCs/>
+          <w:color w:val="156082" w:themeColor="accent1"/>
+        </w:rPr>
+        <w:t>Pour le Chapitre 2 (</w:t>
+      </w:r>
+      <w:proofErr w:type="spellStart"/>
+      <w:r>
+        <w:rPr>
+          <w:i/>
+          <w:iCs/>
+          <w:color w:val="156082" w:themeColor="accent1"/>
+        </w:rPr>
+        <w:t>frameworks</w:t>
+      </w:r>
+      <w:proofErr w:type="spellEnd"/>
+      <w:r>
+        <w:rPr>
+          <w:i/>
+          <w:iCs/>
+          <w:color w:val="156082" w:themeColor="accent1"/>
+        </w:rPr>
+        <w:t xml:space="preserve">) : documentation officielle </w:t>
+      </w:r>
+      <w:proofErr w:type="spellStart"/>
+      <w:r>
+        <w:rPr>
+          <w:i/>
+          <w:iCs/>
+          <w:color w:val="156082" w:themeColor="accent1"/>
+        </w:rPr>
+        <w:t>LangChain</w:t>
+      </w:r>
+      <w:proofErr w:type="spellEnd"/>
+      <w:r>
+        <w:rPr>
+          <w:i/>
+          <w:iCs/>
+          <w:color w:val="156082" w:themeColor="accent1"/>
+        </w:rPr>
+        <w:t>/</w:t>
+      </w:r>
+      <w:proofErr w:type="spellStart"/>
+      <w:r>
+        <w:rPr>
+          <w:i/>
+          <w:iCs/>
+          <w:color w:val="156082" w:themeColor="accent1"/>
+        </w:rPr>
+        <w:t>LlamaIndex</w:t>
+      </w:r>
+      <w:proofErr w:type="spellEnd"/>
+    </w:p>
+    <w:p>
+      <w:pPr>
+        <w:numPr>
+          <w:ilvl w:val="0"/>
+          <w:numId w:val="13"/>
+        </w:numPr>
+        <w:rPr>
+          <w:i/>
+          <w:iCs/>
+          <w:color w:val="156082" w:themeColor="accent1"/>
+        </w:rPr>
+      </w:pPr>
+      <w:r>
+        <w:rPr>
+          <w:i/>
+          <w:iCs/>
+          <w:color w:val="156082" w:themeColor="accent1"/>
+        </w:rPr>
+        <w:t>Pour le Chapitre 3 (</w:t>
+      </w:r>
+      <w:proofErr w:type="spellStart"/>
+      <w:r>
+        <w:rPr>
+          <w:i/>
+          <w:iCs/>
+          <w:color w:val="156082" w:themeColor="accent1"/>
+        </w:rPr>
+        <w:t>LLMs</w:t>
+      </w:r>
+      <w:proofErr w:type="spellEnd"/>
+      <w:r>
+        <w:rPr>
+          <w:i/>
+          <w:iCs/>
+          <w:color w:val="156082" w:themeColor="accent1"/>
+        </w:rPr>
+        <w:t xml:space="preserve">) : </w:t>
+      </w:r>
+      <w:proofErr w:type="spellStart"/>
+      <w:r>
+        <w:rPr>
+          <w:i/>
+          <w:iCs/>
+          <w:color w:val="156082" w:themeColor="accent1"/>
+        </w:rPr>
+        <w:t>papers</w:t>
+      </w:r>
+      <w:proofErr w:type="spellEnd"/>
+      <w:r>
+        <w:rPr>
+          <w:i/>
+          <w:iCs/>
+          <w:color w:val="156082" w:themeColor="accent1"/>
+        </w:rPr>
+        <w:t xml:space="preserve"> Mistral, Llama</w:t>
+      </w:r>
+    </w:p>
+    <w:p>
+      <w:pPr>
+        <w:numPr>
+          <w:ilvl w:val="0"/>
+          <w:numId w:val="13"/>
+        </w:numPr>
+        <w:rPr>
+          <w:i/>
+          <w:iCs/>
+          <w:color w:val="156082" w:themeColor="accent1"/>
+        </w:rPr>
+      </w:pPr>
+      <w:r>
+        <w:rPr>
+          <w:i/>
+          <w:iCs/>
+          <w:color w:val="156082" w:themeColor="accent1"/>
+        </w:rPr>
+        <w:t>Pour le Chapitre 4 (</w:t>
+      </w:r>
+      <w:proofErr w:type="spellStart"/>
+      <w:r>
+        <w:rPr>
+          <w:i/>
+          <w:iCs/>
+          <w:color w:val="156082" w:themeColor="accent1"/>
+        </w:rPr>
+        <w:t>embeddings</w:t>
+      </w:r>
+      <w:proofErr w:type="spellEnd"/>
+      <w:r>
+        <w:rPr>
+          <w:i/>
+          <w:iCs/>
+          <w:color w:val="156082" w:themeColor="accent1"/>
+        </w:rPr>
+        <w:t xml:space="preserve">) : </w:t>
+      </w:r>
+      <w:proofErr w:type="spellStart"/>
+      <w:r>
+        <w:rPr>
+          <w:i/>
+          <w:iCs/>
+          <w:color w:val="156082" w:themeColor="accent1"/>
+        </w:rPr>
+        <w:t>papers</w:t>
+      </w:r>
+      <w:proofErr w:type="spellEnd"/>
+      <w:r>
+        <w:rPr>
+          <w:i/>
+          <w:iCs/>
+          <w:color w:val="156082" w:themeColor="accent1"/>
+        </w:rPr>
+        <w:t xml:space="preserve"> sur les </w:t>
+      </w:r>
+      <w:proofErr w:type="spellStart"/>
+      <w:r>
+        <w:rPr>
+          <w:i/>
+          <w:iCs/>
+          <w:color w:val="156082" w:themeColor="accent1"/>
+        </w:rPr>
+        <w:t>embeddings</w:t>
+      </w:r>
+      <w:proofErr w:type="spellEnd"/>
+      <w:r>
+        <w:rPr>
+          <w:i/>
+          <w:iCs/>
+          <w:color w:val="156082" w:themeColor="accent1"/>
+        </w:rPr>
+        <w:t xml:space="preserve"> multilingues</w:t>
+      </w:r>
+    </w:p>
+    <w:p>
+      <w:pPr>
+        <w:numPr>
+          <w:ilvl w:val="0"/>
+          <w:numId w:val="13"/>
+        </w:numPr>
+        <w:rPr>
+          <w:i/>
+          <w:iCs/>
+          <w:color w:val="156082" w:themeColor="accent1"/>
+        </w:rPr>
+      </w:pPr>
+      <w:r>
+        <w:rPr>
+          <w:i/>
+          <w:iCs/>
+          <w:color w:val="156082" w:themeColor="accent1"/>
+        </w:rPr>
+        <w:t xml:space="preserve">Pour le Chapitre 5 (bases vectorielles) : benchmarks </w:t>
+      </w:r>
+      <w:proofErr w:type="spellStart"/>
+      <w:r>
+        <w:rPr>
+          <w:i/>
+          <w:iCs/>
+          <w:color w:val="156082" w:themeColor="accent1"/>
+        </w:rPr>
+        <w:t>Qdrant</w:t>
+      </w:r>
+      <w:proofErr w:type="spellEnd"/>
+      <w:r>
+        <w:rPr>
+          <w:i/>
+          <w:iCs/>
+          <w:color w:val="156082" w:themeColor="accent1"/>
+        </w:rPr>
+        <w:t>/Chroma/FAISS</w:t>
+      </w:r>
+    </w:p>
+    <w:p>
+      <w:pPr>
+        <w:numPr>
+          <w:ilvl w:val="0"/>
+          <w:numId w:val="13"/>
+        </w:numPr>
+        <w:rPr>
+          <w:i/>
+          <w:iCs/>
+          <w:color w:val="156082" w:themeColor="accent1"/>
+        </w:rPr>
+      </w:pPr>
+      <w:r>
+        <w:rPr>
+          <w:i/>
+          <w:iCs/>
+          <w:color w:val="156082" w:themeColor="accent1"/>
+        </w:rPr>
+        <w:t xml:space="preserve">Pour le Chapitre 7 (RAG francophone) : article </w:t>
+      </w:r>
+      <w:proofErr w:type="spellStart"/>
+      <w:r>
+        <w:rPr>
+          <w:i/>
+          <w:iCs/>
+          <w:color w:val="156082" w:themeColor="accent1"/>
+        </w:rPr>
+        <w:t>ICTjournal</w:t>
+      </w:r>
+      <w:proofErr w:type="spellEnd"/>
+      <w:r>
+        <w:rPr>
+          <w:i/>
+          <w:iCs/>
+          <w:color w:val="156082" w:themeColor="accent1"/>
+        </w:rPr>
+        <w:t xml:space="preserve"> que tu as déjà</w:t>
+      </w:r>
+    </w:p>
+    <w:p/>
     <w:p>
       <w:pPr>
         <w:rPr>
@@ -880,6 +1176,7 @@
     </w:p>
     <w:p>
       <w:r>
+        <w:lastRenderedPageBreak/>
         <w:t xml:space="preserve">Les </w:t>
       </w:r>
       <w:proofErr w:type="spellStart"/>
@@ -902,15 +1199,7 @@
       </w:r>
       <w:proofErr w:type="spellEnd"/>
       <w:r>
-        <w:t xml:space="preserve"> embed-v4 pour le français), la dimension (768-1536 pour un bon équilibre), le domaine (spécifique comme Qwen3 pour le code) et le coût (open-source comme NV-Embed-v2 gratuit vs payants comme </w:t>
-      </w:r>
-      <w:proofErr w:type="spellStart"/>
-      <w:r>
-        <w:t>OpenAI</w:t>
-      </w:r>
-      <w:proofErr w:type="spellEnd"/>
-      <w:r>
-        <w:t>).</w:t>
+        <w:t xml:space="preserve"> embed-v4 pour le français), la dimension (768-1536 pour un bon équilibre), le domaine (spécifique comme Qwen3 pour le code) et le coût (open-source comme NV-Embed-v2 gratuit vs payants comme OpenAI).</w:t>
       </w:r>
       <w:r>
         <w:t xml:space="preserve"> </w:t>
@@ -974,7 +1263,6 @@
     </w:p>
     <w:p>
       <w:r>
-        <w:lastRenderedPageBreak/>
         <w:t xml:space="preserve">La base vectorielle stocke les </w:t>
       </w:r>
       <w:proofErr w:type="spellStart"/>
@@ -1355,7 +1643,11 @@
       </w:r>
       <w:proofErr w:type="spellEnd"/>
       <w:r>
-        <w:t>) recommandent le RAG pour connecter données d'entreprise à l'IA, avec focus sur RGPD et souveraineté (</w:t>
+        <w:t xml:space="preserve">) recommandent le RAG pour connecter données d'entreprise à l'IA, avec </w:t>
+      </w:r>
+      <w:r>
+        <w:lastRenderedPageBreak/>
+        <w:t>focus sur RGPD et souveraineté (</w:t>
       </w:r>
       <w:proofErr w:type="spellStart"/>
       <w:r>
@@ -1981,6 +2273,155 @@
     </w:lvl>
   </w:abstractNum>
   <w:abstractNum w:abstractNumId="4" w15:restartNumberingAfterBreak="0">
+    <w:nsid w:val="2A4C72C2"/>
+    <w:multiLevelType w:val="multilevel"/>
+    <w:tmpl w:val="A5EA9BC4"/>
+    <w:lvl w:ilvl="0">
+      <w:start w:val="1"/>
+      <w:numFmt w:val="bullet"/>
+      <w:lvlText w:val=""/>
+      <w:lvlJc w:val="left"/>
+      <w:pPr>
+        <w:tabs>
+          <w:tab w:val="num" w:pos="720"/>
+        </w:tabs>
+        <w:ind w:left="720" w:hanging="360"/>
+      </w:pPr>
+      <w:rPr>
+        <w:rFonts w:ascii="Symbol" w:hAnsi="Symbol" w:hint="default"/>
+        <w:sz w:val="20"/>
+      </w:rPr>
+    </w:lvl>
+    <w:lvl w:ilvl="1" w:tentative="1">
+      <w:start w:val="1"/>
+      <w:numFmt w:val="bullet"/>
+      <w:lvlText w:val="o"/>
+      <w:lvlJc w:val="left"/>
+      <w:pPr>
+        <w:tabs>
+          <w:tab w:val="num" w:pos="1440"/>
+        </w:tabs>
+        <w:ind w:left="1440" w:hanging="360"/>
+      </w:pPr>
+      <w:rPr>
+        <w:rFonts w:ascii="Courier New" w:hAnsi="Courier New" w:hint="default"/>
+        <w:sz w:val="20"/>
+      </w:rPr>
+    </w:lvl>
+    <w:lvl w:ilvl="2" w:tentative="1">
+      <w:start w:val="1"/>
+      <w:numFmt w:val="bullet"/>
+      <w:lvlText w:val=""/>
+      <w:lvlJc w:val="left"/>
+      <w:pPr>
+        <w:tabs>
+          <w:tab w:val="num" w:pos="2160"/>
+        </w:tabs>
+        <w:ind w:left="2160" w:hanging="360"/>
+      </w:pPr>
+      <w:rPr>
+        <w:rFonts w:ascii="Wingdings" w:hAnsi="Wingdings" w:hint="default"/>
+        <w:sz w:val="20"/>
+      </w:rPr>
+    </w:lvl>
+    <w:lvl w:ilvl="3" w:tentative="1">
+      <w:start w:val="1"/>
+      <w:numFmt w:val="bullet"/>
+      <w:lvlText w:val=""/>
+      <w:lvlJc w:val="left"/>
+      <w:pPr>
+        <w:tabs>
+          <w:tab w:val="num" w:pos="2880"/>
+        </w:tabs>
+        <w:ind w:left="2880" w:hanging="360"/>
+      </w:pPr>
+      <w:rPr>
+        <w:rFonts w:ascii="Wingdings" w:hAnsi="Wingdings" w:hint="default"/>
+        <w:sz w:val="20"/>
+      </w:rPr>
+    </w:lvl>
+    <w:lvl w:ilvl="4" w:tentative="1">
+      <w:start w:val="1"/>
+      <w:numFmt w:val="bullet"/>
+      <w:lvlText w:val=""/>
+      <w:lvlJc w:val="left"/>
+      <w:pPr>
+        <w:tabs>
+          <w:tab w:val="num" w:pos="3600"/>
+        </w:tabs>
+        <w:ind w:left="3600" w:hanging="360"/>
+      </w:pPr>
+      <w:rPr>
+        <w:rFonts w:ascii="Wingdings" w:hAnsi="Wingdings" w:hint="default"/>
+        <w:sz w:val="20"/>
+      </w:rPr>
+    </w:lvl>
+    <w:lvl w:ilvl="5" w:tentative="1">
+      <w:start w:val="1"/>
+      <w:numFmt w:val="bullet"/>
+      <w:lvlText w:val=""/>
+      <w:lvlJc w:val="left"/>
+      <w:pPr>
+        <w:tabs>
+          <w:tab w:val="num" w:pos="4320"/>
+        </w:tabs>
+        <w:ind w:left="4320" w:hanging="360"/>
+      </w:pPr>
+      <w:rPr>
+        <w:rFonts w:ascii="Wingdings" w:hAnsi="Wingdings" w:hint="default"/>
+        <w:sz w:val="20"/>
+      </w:rPr>
+    </w:lvl>
+    <w:lvl w:ilvl="6" w:tentative="1">
+      <w:start w:val="1"/>
+      <w:numFmt w:val="bullet"/>
+      <w:lvlText w:val=""/>
+      <w:lvlJc w:val="left"/>
+      <w:pPr>
+        <w:tabs>
+          <w:tab w:val="num" w:pos="5040"/>
+        </w:tabs>
+        <w:ind w:left="5040" w:hanging="360"/>
+      </w:pPr>
+      <w:rPr>
+        <w:rFonts w:ascii="Wingdings" w:hAnsi="Wingdings" w:hint="default"/>
+        <w:sz w:val="20"/>
+      </w:rPr>
+    </w:lvl>
+    <w:lvl w:ilvl="7" w:tentative="1">
+      <w:start w:val="1"/>
+      <w:numFmt w:val="bullet"/>
+      <w:lvlText w:val=""/>
+      <w:lvlJc w:val="left"/>
+      <w:pPr>
+        <w:tabs>
+          <w:tab w:val="num" w:pos="5760"/>
+        </w:tabs>
+        <w:ind w:left="5760" w:hanging="360"/>
+      </w:pPr>
+      <w:rPr>
+        <w:rFonts w:ascii="Wingdings" w:hAnsi="Wingdings" w:hint="default"/>
+        <w:sz w:val="20"/>
+      </w:rPr>
+    </w:lvl>
+    <w:lvl w:ilvl="8" w:tentative="1">
+      <w:start w:val="1"/>
+      <w:numFmt w:val="bullet"/>
+      <w:lvlText w:val=""/>
+      <w:lvlJc w:val="left"/>
+      <w:pPr>
+        <w:tabs>
+          <w:tab w:val="num" w:pos="6480"/>
+        </w:tabs>
+        <w:ind w:left="6480" w:hanging="360"/>
+      </w:pPr>
+      <w:rPr>
+        <w:rFonts w:ascii="Wingdings" w:hAnsi="Wingdings" w:hint="default"/>
+        <w:sz w:val="20"/>
+      </w:rPr>
+    </w:lvl>
+  </w:abstractNum>
+  <w:abstractNum w:abstractNumId="5" w15:restartNumberingAfterBreak="0">
     <w:nsid w:val="3962342B"/>
     <w:multiLevelType w:val="multilevel"/>
     <w:tmpl w:val="1D6C398A"/>
@@ -2129,7 +2570,7 @@
       </w:rPr>
     </w:lvl>
   </w:abstractNum>
-  <w:abstractNum w:abstractNumId="5" w15:restartNumberingAfterBreak="0">
+  <w:abstractNum w:abstractNumId="6" w15:restartNumberingAfterBreak="0">
     <w:nsid w:val="3D7D281A"/>
     <w:multiLevelType w:val="multilevel"/>
     <w:tmpl w:val="73AC2E0A"/>
@@ -2278,7 +2719,7 @@
       </w:rPr>
     </w:lvl>
   </w:abstractNum>
-  <w:abstractNum w:abstractNumId="6" w15:restartNumberingAfterBreak="0">
+  <w:abstractNum w:abstractNumId="7" w15:restartNumberingAfterBreak="0">
     <w:nsid w:val="66F33668"/>
     <w:multiLevelType w:val="multilevel"/>
     <w:tmpl w:val="C2968820"/>
@@ -2427,7 +2868,7 @@
       </w:rPr>
     </w:lvl>
   </w:abstractNum>
-  <w:abstractNum w:abstractNumId="7" w15:restartNumberingAfterBreak="0">
+  <w:abstractNum w:abstractNumId="8" w15:restartNumberingAfterBreak="0">
     <w:nsid w:val="695946DD"/>
     <w:multiLevelType w:val="multilevel"/>
     <w:tmpl w:val="BAE0CAB0"/>
@@ -2576,7 +3017,7 @@
       </w:rPr>
     </w:lvl>
   </w:abstractNum>
-  <w:abstractNum w:abstractNumId="8" w15:restartNumberingAfterBreak="0">
+  <w:abstractNum w:abstractNumId="9" w15:restartNumberingAfterBreak="0">
     <w:nsid w:val="698D1189"/>
     <w:multiLevelType w:val="multilevel"/>
     <w:tmpl w:val="F1F25A92"/>
@@ -2725,7 +3166,7 @@
       </w:rPr>
     </w:lvl>
   </w:abstractNum>
-  <w:abstractNum w:abstractNumId="9" w15:restartNumberingAfterBreak="0">
+  <w:abstractNum w:abstractNumId="10" w15:restartNumberingAfterBreak="0">
     <w:nsid w:val="6D0D58DC"/>
     <w:multiLevelType w:val="multilevel"/>
     <w:tmpl w:val="966407A8"/>
@@ -2874,7 +3315,7 @@
       </w:rPr>
     </w:lvl>
   </w:abstractNum>
-  <w:abstractNum w:abstractNumId="10" w15:restartNumberingAfterBreak="0">
+  <w:abstractNum w:abstractNumId="11" w15:restartNumberingAfterBreak="0">
     <w:nsid w:val="78F0749E"/>
     <w:multiLevelType w:val="multilevel"/>
     <w:tmpl w:val="5922D760"/>
@@ -3023,7 +3464,7 @@
       </w:rPr>
     </w:lvl>
   </w:abstractNum>
-  <w:abstractNum w:abstractNumId="11" w15:restartNumberingAfterBreak="0">
+  <w:abstractNum w:abstractNumId="12" w15:restartNumberingAfterBreak="0">
     <w:nsid w:val="7E500D2B"/>
     <w:multiLevelType w:val="multilevel"/>
     <w:tmpl w:val="BABC7762"/>
@@ -3173,7 +3614,7 @@
     </w:lvl>
   </w:abstractNum>
   <w:num w:numId="1" w16cid:durableId="775444032">
-    <w:abstractNumId w:val="11"/>
+    <w:abstractNumId w:val="12"/>
   </w:num>
   <w:num w:numId="2" w16cid:durableId="1919241981">
     <w:abstractNumId w:val="2"/>
@@ -3182,30 +3623,33 @@
     <w:abstractNumId w:val="0"/>
   </w:num>
   <w:num w:numId="4" w16cid:durableId="181818229">
+    <w:abstractNumId w:val="9"/>
+  </w:num>
+  <w:num w:numId="5" w16cid:durableId="1079323579">
     <w:abstractNumId w:val="8"/>
   </w:num>
-  <w:num w:numId="5" w16cid:durableId="1079323579">
+  <w:num w:numId="6" w16cid:durableId="1823154635">
     <w:abstractNumId w:val="7"/>
-  </w:num>
-  <w:num w:numId="6" w16cid:durableId="1823154635">
-    <w:abstractNumId w:val="6"/>
   </w:num>
   <w:num w:numId="7" w16cid:durableId="2319072">
     <w:abstractNumId w:val="3"/>
   </w:num>
   <w:num w:numId="8" w16cid:durableId="300506653">
-    <w:abstractNumId w:val="10"/>
+    <w:abstractNumId w:val="11"/>
   </w:num>
   <w:num w:numId="9" w16cid:durableId="1577013300">
-    <w:abstractNumId w:val="5"/>
+    <w:abstractNumId w:val="6"/>
   </w:num>
   <w:num w:numId="10" w16cid:durableId="1821264856">
     <w:abstractNumId w:val="1"/>
   </w:num>
   <w:num w:numId="11" w16cid:durableId="211577877">
-    <w:abstractNumId w:val="9"/>
+    <w:abstractNumId w:val="10"/>
   </w:num>
   <w:num w:numId="12" w16cid:durableId="1698651273">
+    <w:abstractNumId w:val="5"/>
+  </w:num>
+  <w:num w:numId="13" w16cid:durableId="381104760">
     <w:abstractNumId w:val="4"/>
   </w:num>
 </w:numbering>
@@ -3613,11 +4057,11 @@
     <w:qFormat/>
     <w:rsid w:val="00EC4705"/>
   </w:style>
-  <w:style w:type="paragraph" w:styleId="Heading1">
+  <w:style w:type="paragraph" w:styleId="Titre1">
     <w:name w:val="heading 1"/>
     <w:basedOn w:val="Normal"/>
     <w:next w:val="Normal"/>
-    <w:link w:val="Heading1Char"/>
+    <w:link w:val="Titre1Car"/>
     <w:uiPriority w:val="9"/>
     <w:qFormat/>
     <w:rsid w:val="00082F1E"/>
@@ -3634,11 +4078,11 @@
       <w:szCs w:val="40"/>
     </w:rPr>
   </w:style>
-  <w:style w:type="paragraph" w:styleId="Heading2">
+  <w:style w:type="paragraph" w:styleId="Titre2">
     <w:name w:val="heading 2"/>
     <w:basedOn w:val="Normal"/>
     <w:next w:val="Normal"/>
-    <w:link w:val="Heading2Char"/>
+    <w:link w:val="Titre2Car"/>
     <w:uiPriority w:val="9"/>
     <w:semiHidden/>
     <w:unhideWhenUsed/>
@@ -3657,11 +4101,11 @@
       <w:szCs w:val="32"/>
     </w:rPr>
   </w:style>
-  <w:style w:type="paragraph" w:styleId="Heading3">
+  <w:style w:type="paragraph" w:styleId="Titre3">
     <w:name w:val="heading 3"/>
     <w:basedOn w:val="Normal"/>
     <w:next w:val="Normal"/>
-    <w:link w:val="Heading3Char"/>
+    <w:link w:val="Titre3Car"/>
     <w:uiPriority w:val="9"/>
     <w:semiHidden/>
     <w:unhideWhenUsed/>
@@ -3680,11 +4124,11 @@
       <w:szCs w:val="28"/>
     </w:rPr>
   </w:style>
-  <w:style w:type="paragraph" w:styleId="Heading4">
+  <w:style w:type="paragraph" w:styleId="Titre4">
     <w:name w:val="heading 4"/>
     <w:basedOn w:val="Normal"/>
     <w:next w:val="Normal"/>
-    <w:link w:val="Heading4Char"/>
+    <w:link w:val="Titre4Car"/>
     <w:uiPriority w:val="9"/>
     <w:semiHidden/>
     <w:unhideWhenUsed/>
@@ -3703,11 +4147,11 @@
       <w:color w:val="0F4761" w:themeColor="accent1" w:themeShade="BF"/>
     </w:rPr>
   </w:style>
-  <w:style w:type="paragraph" w:styleId="Heading5">
+  <w:style w:type="paragraph" w:styleId="Titre5">
     <w:name w:val="heading 5"/>
     <w:basedOn w:val="Normal"/>
     <w:next w:val="Normal"/>
-    <w:link w:val="Heading5Char"/>
+    <w:link w:val="Titre5Car"/>
     <w:uiPriority w:val="9"/>
     <w:semiHidden/>
     <w:unhideWhenUsed/>
@@ -3724,11 +4168,11 @@
       <w:color w:val="0F4761" w:themeColor="accent1" w:themeShade="BF"/>
     </w:rPr>
   </w:style>
-  <w:style w:type="paragraph" w:styleId="Heading6">
+  <w:style w:type="paragraph" w:styleId="Titre6">
     <w:name w:val="heading 6"/>
     <w:basedOn w:val="Normal"/>
     <w:next w:val="Normal"/>
-    <w:link w:val="Heading6Char"/>
+    <w:link w:val="Titre6Car"/>
     <w:uiPriority w:val="9"/>
     <w:semiHidden/>
     <w:unhideWhenUsed/>
@@ -3747,11 +4191,11 @@
       <w:color w:val="595959" w:themeColor="text1" w:themeTint="A6"/>
     </w:rPr>
   </w:style>
-  <w:style w:type="paragraph" w:styleId="Heading7">
+  <w:style w:type="paragraph" w:styleId="Titre7">
     <w:name w:val="heading 7"/>
     <w:basedOn w:val="Normal"/>
     <w:next w:val="Normal"/>
-    <w:link w:val="Heading7Char"/>
+    <w:link w:val="Titre7Car"/>
     <w:uiPriority w:val="9"/>
     <w:semiHidden/>
     <w:unhideWhenUsed/>
@@ -3768,11 +4212,11 @@
       <w:color w:val="595959" w:themeColor="text1" w:themeTint="A6"/>
     </w:rPr>
   </w:style>
-  <w:style w:type="paragraph" w:styleId="Heading8">
+  <w:style w:type="paragraph" w:styleId="Titre8">
     <w:name w:val="heading 8"/>
     <w:basedOn w:val="Normal"/>
     <w:next w:val="Normal"/>
-    <w:link w:val="Heading8Char"/>
+    <w:link w:val="Titre8Car"/>
     <w:uiPriority w:val="9"/>
     <w:semiHidden/>
     <w:unhideWhenUsed/>
@@ -3791,11 +4235,11 @@
       <w:color w:val="272727" w:themeColor="text1" w:themeTint="D8"/>
     </w:rPr>
   </w:style>
-  <w:style w:type="paragraph" w:styleId="Heading9">
+  <w:style w:type="paragraph" w:styleId="Titre9">
     <w:name w:val="heading 9"/>
     <w:basedOn w:val="Normal"/>
     <w:next w:val="Normal"/>
-    <w:link w:val="Heading9Char"/>
+    <w:link w:val="Titre9Car"/>
     <w:uiPriority w:val="9"/>
     <w:semiHidden/>
     <w:unhideWhenUsed/>
@@ -3812,12 +4256,12 @@
       <w:color w:val="272727" w:themeColor="text1" w:themeTint="D8"/>
     </w:rPr>
   </w:style>
-  <w:style w:type="character" w:default="1" w:styleId="DefaultParagraphFont">
+  <w:style w:type="character" w:default="1" w:styleId="Policepardfaut">
     <w:name w:val="Default Paragraph Font"/>
     <w:uiPriority w:val="1"/>
     <w:unhideWhenUsed/>
   </w:style>
-  <w:style w:type="table" w:default="1" w:styleId="TableNormal">
+  <w:style w:type="table" w:default="1" w:styleId="TableauNormal">
     <w:name w:val="Normal Table"/>
     <w:uiPriority w:val="99"/>
     <w:semiHidden/>
@@ -3832,16 +4276,16 @@
       </w:tblCellMar>
     </w:tblPr>
   </w:style>
-  <w:style w:type="numbering" w:default="1" w:styleId="NoList">
+  <w:style w:type="numbering" w:default="1" w:styleId="Aucuneliste">
     <w:name w:val="No List"/>
     <w:uiPriority w:val="99"/>
     <w:semiHidden/>
     <w:unhideWhenUsed/>
   </w:style>
-  <w:style w:type="character" w:customStyle="1" w:styleId="Heading1Char">
-    <w:name w:val="Heading 1 Char"/>
-    <w:basedOn w:val="DefaultParagraphFont"/>
-    <w:link w:val="Heading1"/>
+  <w:style w:type="character" w:customStyle="1" w:styleId="Titre1Car">
+    <w:name w:val="Titre 1 Car"/>
+    <w:basedOn w:val="Policepardfaut"/>
+    <w:link w:val="Titre1"/>
     <w:uiPriority w:val="9"/>
     <w:rsid w:val="00082F1E"/>
     <w:rPr>
@@ -3851,10 +4295,10 @@
       <w:szCs w:val="40"/>
     </w:rPr>
   </w:style>
-  <w:style w:type="character" w:customStyle="1" w:styleId="Heading2Char">
-    <w:name w:val="Heading 2 Char"/>
-    <w:basedOn w:val="DefaultParagraphFont"/>
-    <w:link w:val="Heading2"/>
+  <w:style w:type="character" w:customStyle="1" w:styleId="Titre2Car">
+    <w:name w:val="Titre 2 Car"/>
+    <w:basedOn w:val="Policepardfaut"/>
+    <w:link w:val="Titre2"/>
     <w:uiPriority w:val="9"/>
     <w:semiHidden/>
     <w:rsid w:val="00082F1E"/>
@@ -3865,10 +4309,10 @@
       <w:szCs w:val="32"/>
     </w:rPr>
   </w:style>
-  <w:style w:type="character" w:customStyle="1" w:styleId="Heading3Char">
-    <w:name w:val="Heading 3 Char"/>
-    <w:basedOn w:val="DefaultParagraphFont"/>
-    <w:link w:val="Heading3"/>
+  <w:style w:type="character" w:customStyle="1" w:styleId="Titre3Car">
+    <w:name w:val="Titre 3 Car"/>
+    <w:basedOn w:val="Policepardfaut"/>
+    <w:link w:val="Titre3"/>
     <w:uiPriority w:val="9"/>
     <w:semiHidden/>
     <w:rsid w:val="00082F1E"/>
@@ -3879,10 +4323,10 @@
       <w:szCs w:val="28"/>
     </w:rPr>
   </w:style>
-  <w:style w:type="character" w:customStyle="1" w:styleId="Heading4Char">
-    <w:name w:val="Heading 4 Char"/>
-    <w:basedOn w:val="DefaultParagraphFont"/>
-    <w:link w:val="Heading4"/>
+  <w:style w:type="character" w:customStyle="1" w:styleId="Titre4Car">
+    <w:name w:val="Titre 4 Car"/>
+    <w:basedOn w:val="Policepardfaut"/>
+    <w:link w:val="Titre4"/>
     <w:uiPriority w:val="9"/>
     <w:semiHidden/>
     <w:rsid w:val="00082F1E"/>
@@ -3893,10 +4337,10 @@
       <w:color w:val="0F4761" w:themeColor="accent1" w:themeShade="BF"/>
     </w:rPr>
   </w:style>
-  <w:style w:type="character" w:customStyle="1" w:styleId="Heading5Char">
-    <w:name w:val="Heading 5 Char"/>
-    <w:basedOn w:val="DefaultParagraphFont"/>
-    <w:link w:val="Heading5"/>
+  <w:style w:type="character" w:customStyle="1" w:styleId="Titre5Car">
+    <w:name w:val="Titre 5 Car"/>
+    <w:basedOn w:val="Policepardfaut"/>
+    <w:link w:val="Titre5"/>
     <w:uiPriority w:val="9"/>
     <w:semiHidden/>
     <w:rsid w:val="00082F1E"/>
@@ -3905,10 +4349,10 @@
       <w:color w:val="0F4761" w:themeColor="accent1" w:themeShade="BF"/>
     </w:rPr>
   </w:style>
-  <w:style w:type="character" w:customStyle="1" w:styleId="Heading6Char">
-    <w:name w:val="Heading 6 Char"/>
-    <w:basedOn w:val="DefaultParagraphFont"/>
-    <w:link w:val="Heading6"/>
+  <w:style w:type="character" w:customStyle="1" w:styleId="Titre6Car">
+    <w:name w:val="Titre 6 Car"/>
+    <w:basedOn w:val="Policepardfaut"/>
+    <w:link w:val="Titre6"/>
     <w:uiPriority w:val="9"/>
     <w:semiHidden/>
     <w:rsid w:val="00082F1E"/>
@@ -3919,10 +4363,10 @@
       <w:color w:val="595959" w:themeColor="text1" w:themeTint="A6"/>
     </w:rPr>
   </w:style>
-  <w:style w:type="character" w:customStyle="1" w:styleId="Heading7Char">
-    <w:name w:val="Heading 7 Char"/>
-    <w:basedOn w:val="DefaultParagraphFont"/>
-    <w:link w:val="Heading7"/>
+  <w:style w:type="character" w:customStyle="1" w:styleId="Titre7Car">
+    <w:name w:val="Titre 7 Car"/>
+    <w:basedOn w:val="Policepardfaut"/>
+    <w:link w:val="Titre7"/>
     <w:uiPriority w:val="9"/>
     <w:semiHidden/>
     <w:rsid w:val="00082F1E"/>
@@ -3931,10 +4375,10 @@
       <w:color w:val="595959" w:themeColor="text1" w:themeTint="A6"/>
     </w:rPr>
   </w:style>
-  <w:style w:type="character" w:customStyle="1" w:styleId="Heading8Char">
-    <w:name w:val="Heading 8 Char"/>
-    <w:basedOn w:val="DefaultParagraphFont"/>
-    <w:link w:val="Heading8"/>
+  <w:style w:type="character" w:customStyle="1" w:styleId="Titre8Car">
+    <w:name w:val="Titre 8 Car"/>
+    <w:basedOn w:val="Policepardfaut"/>
+    <w:link w:val="Titre8"/>
     <w:uiPriority w:val="9"/>
     <w:semiHidden/>
     <w:rsid w:val="00082F1E"/>
@@ -3945,10 +4389,10 @@
       <w:color w:val="272727" w:themeColor="text1" w:themeTint="D8"/>
     </w:rPr>
   </w:style>
-  <w:style w:type="character" w:customStyle="1" w:styleId="Heading9Char">
-    <w:name w:val="Heading 9 Char"/>
-    <w:basedOn w:val="DefaultParagraphFont"/>
-    <w:link w:val="Heading9"/>
+  <w:style w:type="character" w:customStyle="1" w:styleId="Titre9Car">
+    <w:name w:val="Titre 9 Car"/>
+    <w:basedOn w:val="Policepardfaut"/>
+    <w:link w:val="Titre9"/>
     <w:uiPriority w:val="9"/>
     <w:semiHidden/>
     <w:rsid w:val="00082F1E"/>
@@ -3957,11 +4401,11 @@
       <w:color w:val="272727" w:themeColor="text1" w:themeTint="D8"/>
     </w:rPr>
   </w:style>
-  <w:style w:type="paragraph" w:styleId="Title">
+  <w:style w:type="paragraph" w:styleId="Titre">
     <w:name w:val="Title"/>
     <w:basedOn w:val="Normal"/>
     <w:next w:val="Normal"/>
-    <w:link w:val="TitleChar"/>
+    <w:link w:val="TitreCar"/>
     <w:uiPriority w:val="10"/>
     <w:qFormat/>
     <w:rsid w:val="00082F1E"/>
@@ -3977,10 +4421,10 @@
       <w:szCs w:val="56"/>
     </w:rPr>
   </w:style>
-  <w:style w:type="character" w:customStyle="1" w:styleId="TitleChar">
-    <w:name w:val="Title Char"/>
-    <w:basedOn w:val="DefaultParagraphFont"/>
-    <w:link w:val="Title"/>
+  <w:style w:type="character" w:customStyle="1" w:styleId="TitreCar">
+    <w:name w:val="Titre Car"/>
+    <w:basedOn w:val="Policepardfaut"/>
+    <w:link w:val="Titre"/>
     <w:uiPriority w:val="10"/>
     <w:rsid w:val="00082F1E"/>
     <w:rPr>
@@ -3991,11 +4435,11 @@
       <w:szCs w:val="56"/>
     </w:rPr>
   </w:style>
-  <w:style w:type="paragraph" w:styleId="Subtitle">
+  <w:style w:type="paragraph" w:styleId="Sous-titre">
     <w:name w:val="Subtitle"/>
     <w:basedOn w:val="Normal"/>
     <w:next w:val="Normal"/>
-    <w:link w:val="SubtitleChar"/>
+    <w:link w:val="Sous-titreCar"/>
     <w:uiPriority w:val="11"/>
     <w:qFormat/>
     <w:rsid w:val="00082F1E"/>
@@ -4012,10 +4456,10 @@
       <w:szCs w:val="28"/>
     </w:rPr>
   </w:style>
-  <w:style w:type="character" w:customStyle="1" w:styleId="SubtitleChar">
-    <w:name w:val="Subtitle Char"/>
-    <w:basedOn w:val="DefaultParagraphFont"/>
-    <w:link w:val="Subtitle"/>
+  <w:style w:type="character" w:customStyle="1" w:styleId="Sous-titreCar">
+    <w:name w:val="Sous-titre Car"/>
+    <w:basedOn w:val="Policepardfaut"/>
+    <w:link w:val="Sous-titre"/>
     <w:uiPriority w:val="11"/>
     <w:rsid w:val="00082F1E"/>
     <w:rPr>
@@ -4026,11 +4470,11 @@
       <w:szCs w:val="28"/>
     </w:rPr>
   </w:style>
-  <w:style w:type="paragraph" w:styleId="Quote">
+  <w:style w:type="paragraph" w:styleId="Citation">
     <w:name w:val="Quote"/>
     <w:basedOn w:val="Normal"/>
     <w:next w:val="Normal"/>
-    <w:link w:val="QuoteChar"/>
+    <w:link w:val="CitationCar"/>
     <w:uiPriority w:val="29"/>
     <w:qFormat/>
     <w:rsid w:val="00082F1E"/>
@@ -4044,10 +4488,10 @@
       <w:color w:val="404040" w:themeColor="text1" w:themeTint="BF"/>
     </w:rPr>
   </w:style>
-  <w:style w:type="character" w:customStyle="1" w:styleId="QuoteChar">
-    <w:name w:val="Quote Char"/>
-    <w:basedOn w:val="DefaultParagraphFont"/>
-    <w:link w:val="Quote"/>
+  <w:style w:type="character" w:customStyle="1" w:styleId="CitationCar">
+    <w:name w:val="Citation Car"/>
+    <w:basedOn w:val="Policepardfaut"/>
+    <w:link w:val="Citation"/>
     <w:uiPriority w:val="29"/>
     <w:rsid w:val="00082F1E"/>
     <w:rPr>
@@ -4056,7 +4500,7 @@
       <w:color w:val="404040" w:themeColor="text1" w:themeTint="BF"/>
     </w:rPr>
   </w:style>
-  <w:style w:type="paragraph" w:styleId="ListParagraph">
+  <w:style w:type="paragraph" w:styleId="Paragraphedeliste">
     <w:name w:val="List Paragraph"/>
     <w:basedOn w:val="Normal"/>
     <w:uiPriority w:val="34"/>
@@ -4067,9 +4511,9 @@
       <w:contextualSpacing/>
     </w:pPr>
   </w:style>
-  <w:style w:type="character" w:styleId="IntenseEmphasis">
+  <w:style w:type="character" w:styleId="Accentuationintense">
     <w:name w:val="Intense Emphasis"/>
-    <w:basedOn w:val="DefaultParagraphFont"/>
+    <w:basedOn w:val="Policepardfaut"/>
     <w:uiPriority w:val="21"/>
     <w:qFormat/>
     <w:rsid w:val="00082F1E"/>
@@ -4079,11 +4523,11 @@
       <w:color w:val="0F4761" w:themeColor="accent1" w:themeShade="BF"/>
     </w:rPr>
   </w:style>
-  <w:style w:type="paragraph" w:styleId="IntenseQuote">
+  <w:style w:type="paragraph" w:styleId="Citationintense">
     <w:name w:val="Intense Quote"/>
     <w:basedOn w:val="Normal"/>
     <w:next w:val="Normal"/>
-    <w:link w:val="IntenseQuoteChar"/>
+    <w:link w:val="CitationintenseCar"/>
     <w:uiPriority w:val="30"/>
     <w:qFormat/>
     <w:rsid w:val="00082F1E"/>
@@ -4102,10 +4546,10 @@
       <w:color w:val="0F4761" w:themeColor="accent1" w:themeShade="BF"/>
     </w:rPr>
   </w:style>
-  <w:style w:type="character" w:customStyle="1" w:styleId="IntenseQuoteChar">
-    <w:name w:val="Intense Quote Char"/>
-    <w:basedOn w:val="DefaultParagraphFont"/>
-    <w:link w:val="IntenseQuote"/>
+  <w:style w:type="character" w:customStyle="1" w:styleId="CitationintenseCar">
+    <w:name w:val="Citation intense Car"/>
+    <w:basedOn w:val="Policepardfaut"/>
+    <w:link w:val="Citationintense"/>
     <w:uiPriority w:val="30"/>
     <w:rsid w:val="00082F1E"/>
     <w:rPr>
@@ -4114,9 +4558,9 @@
       <w:color w:val="0F4761" w:themeColor="accent1" w:themeShade="BF"/>
     </w:rPr>
   </w:style>
-  <w:style w:type="character" w:styleId="IntenseReference">
+  <w:style w:type="character" w:styleId="Rfrenceintense">
     <w:name w:val="Intense Reference"/>
-    <w:basedOn w:val="DefaultParagraphFont"/>
+    <w:basedOn w:val="Policepardfaut"/>
     <w:uiPriority w:val="32"/>
     <w:qFormat/>
     <w:rsid w:val="00082F1E"/>

</xml_diff>